<commit_message>
For some reason I needed to commit
</commit_message>
<xml_diff>
--- a/Project tech stack.docx
+++ b/Project tech stack.docx
@@ -678,6 +678,199 @@
           <w:color w:val="1F1F1F"/>
         </w:rPr>
         <w:t>?</w:t>
+      </w:r>
+      <w:proofErr w:type="gramEnd"/>
+    </w:p>
+    <w:p>
+      <w:pPr>
+        <w:widowControl w:val="0"/>
+        <w:pBdr>
+          <w:top w:val="nil"/>
+          <w:left w:val="nil"/>
+          <w:bottom w:val="nil"/>
+          <w:right w:val="nil"/>
+          <w:between w:val="nil"/>
+        </w:pBdr>
+        <w:spacing w:after="120" w:line="275" w:lineRule="auto"/>
+      </w:pPr>
+    </w:p>
+    <w:p>
+      <w:pPr>
+        <w:pStyle w:val="Heading3"/>
+        <w:spacing w:after="120" w:line="275" w:lineRule="auto"/>
+        <w:rPr>
+          <w:rFonts w:ascii="Google Sans" w:eastAsia="Google Sans" w:hAnsi="Google Sans" w:cs="Google Sans"/>
+          <w:color w:val="3A7C22" w:themeColor="accent6" w:themeShade="BF"/>
+        </w:rPr>
+      </w:pPr>
+      <w:r>
+        <w:rPr>
+          <w:rFonts w:ascii="Google Sans" w:eastAsia="Google Sans" w:hAnsi="Google Sans" w:cs="Google Sans"/>
+          <w:color w:val="3A7C22" w:themeColor="accent6" w:themeShade="BF"/>
+        </w:rPr>
+        <w:t>5</w:t>
+      </w:r>
+      <w:r>
+        <w:rPr>
+          <w:rFonts w:ascii="Google Sans" w:eastAsia="Google Sans" w:hAnsi="Google Sans" w:cs="Google Sans"/>
+          <w:color w:val="3A7C22" w:themeColor="accent6" w:themeShade="BF"/>
+        </w:rPr>
+        <w:t xml:space="preserve">. </w:t>
+      </w:r>
+      <w:r>
+        <w:rPr>
+          <w:rFonts w:ascii="Google Sans" w:eastAsia="Google Sans" w:hAnsi="Google Sans" w:cs="Google Sans"/>
+          <w:color w:val="3A7C22" w:themeColor="accent6" w:themeShade="BF"/>
+        </w:rPr>
+        <w:t xml:space="preserve">Design </w:t>
+      </w:r>
+    </w:p>
+    <w:p>
+      <w:pPr>
+        <w:widowControl w:val="0"/>
+        <w:numPr>
+          <w:ilvl w:val="0"/>
+          <w:numId w:val="4"/>
+        </w:numPr>
+        <w:pBdr>
+          <w:top w:val="nil"/>
+          <w:left w:val="nil"/>
+          <w:bottom w:val="nil"/>
+          <w:right w:val="nil"/>
+          <w:between w:val="nil"/>
+        </w:pBdr>
+        <w:spacing w:after="0" w:line="275" w:lineRule="auto"/>
+      </w:pPr>
+      <w:r>
+        <w:rPr>
+          <w:rFonts w:ascii="Google Sans" w:eastAsia="Google Sans" w:hAnsi="Google Sans" w:cs="Google Sans"/>
+          <w:b/>
+          <w:bCs/>
+          <w:color w:val="1F1F1F"/>
+        </w:rPr>
+        <w:t>Tool:</w:t>
+      </w:r>
+      <w:r>
+        <w:rPr>
+          <w:rFonts w:ascii="Google Sans" w:eastAsia="Google Sans" w:hAnsi="Google Sans" w:cs="Google Sans"/>
+          <w:color w:val="1F1F1F"/>
+        </w:rPr>
+        <w:t xml:space="preserve"> </w:t>
+      </w:r>
+      <w:r>
+        <w:rPr>
+          <w:rFonts w:ascii="Google Sans" w:eastAsia="Google Sans" w:hAnsi="Google Sans" w:cs="Google Sans"/>
+          <w:b/>
+          <w:bCs/>
+          <w:color w:val="3A7C22" w:themeColor="accent6" w:themeShade="BF"/>
+        </w:rPr>
+        <w:t>moqups.com</w:t>
+      </w:r>
+    </w:p>
+    <w:p>
+      <w:pPr>
+        <w:widowControl w:val="0"/>
+        <w:numPr>
+          <w:ilvl w:val="0"/>
+          <w:numId w:val="4"/>
+        </w:numPr>
+        <w:pBdr>
+          <w:top w:val="nil"/>
+          <w:left w:val="nil"/>
+          <w:bottom w:val="nil"/>
+          <w:right w:val="nil"/>
+          <w:between w:val="nil"/>
+        </w:pBdr>
+        <w:spacing w:after="0" w:line="275" w:lineRule="auto"/>
+      </w:pPr>
+      <w:r>
+        <w:rPr>
+          <w:rFonts w:ascii="Google Sans" w:eastAsia="Google Sans" w:hAnsi="Google Sans" w:cs="Google Sans"/>
+          <w:b/>
+          <w:bCs/>
+          <w:color w:val="1F1F1F"/>
+        </w:rPr>
+        <w:t>Approach:</w:t>
+      </w:r>
+      <w:r>
+        <w:rPr>
+          <w:rFonts w:ascii="Google Sans" w:eastAsia="Google Sans" w:hAnsi="Google Sans" w:cs="Google Sans"/>
+          <w:color w:val="1F1F1F"/>
+        </w:rPr>
+        <w:t xml:space="preserve"> </w:t>
+      </w:r>
+      <w:r>
+        <w:rPr>
+          <w:rFonts w:ascii="Google Sans" w:eastAsia="Google Sans" w:hAnsi="Google Sans" w:cs="Google Sans"/>
+          <w:color w:val="1F1F1F"/>
+        </w:rPr>
+        <w:t xml:space="preserve">We will use </w:t>
+      </w:r>
+      <w:proofErr w:type="spellStart"/>
+      <w:r>
+        <w:rPr>
+          <w:rFonts w:ascii="Google Sans" w:eastAsia="Google Sans" w:hAnsi="Google Sans" w:cs="Google Sans"/>
+          <w:color w:val="1F1F1F"/>
+        </w:rPr>
+        <w:t>moqup</w:t>
+      </w:r>
+      <w:proofErr w:type="spellEnd"/>
+      <w:r>
+        <w:rPr>
+          <w:rFonts w:ascii="Google Sans" w:eastAsia="Google Sans" w:hAnsi="Google Sans" w:cs="Google Sans"/>
+          <w:color w:val="1F1F1F"/>
+        </w:rPr>
+        <w:t xml:space="preserve"> to design basic wireframes and </w:t>
+      </w:r>
+      <w:r>
+        <w:rPr>
+          <w:rFonts w:ascii="Google Sans" w:eastAsia="Google Sans" w:hAnsi="Google Sans" w:cs="Google Sans"/>
+          <w:color w:val="1F1F1F"/>
+        </w:rPr>
+        <w:t>webpages</w:t>
+      </w:r>
+    </w:p>
+    <w:p>
+      <w:pPr>
+        <w:widowControl w:val="0"/>
+        <w:numPr>
+          <w:ilvl w:val="0"/>
+          <w:numId w:val="4"/>
+        </w:numPr>
+        <w:pBdr>
+          <w:top w:val="nil"/>
+          <w:left w:val="nil"/>
+          <w:bottom w:val="nil"/>
+          <w:right w:val="nil"/>
+          <w:between w:val="nil"/>
+        </w:pBdr>
+        <w:spacing w:after="120" w:line="275" w:lineRule="auto"/>
+      </w:pPr>
+      <w:r>
+        <w:rPr>
+          <w:rFonts w:ascii="Google Sans" w:eastAsia="Google Sans" w:hAnsi="Google Sans" w:cs="Google Sans"/>
+          <w:b/>
+          <w:bCs/>
+          <w:color w:val="1F1F1F"/>
+        </w:rPr>
+        <w:t>Who handles this</w:t>
+      </w:r>
+      <w:proofErr w:type="gramStart"/>
+      <w:r>
+        <w:rPr>
+          <w:rFonts w:ascii="Google Sans" w:eastAsia="Google Sans" w:hAnsi="Google Sans" w:cs="Google Sans"/>
+          <w:b/>
+          <w:bCs/>
+          <w:color w:val="1F1F1F"/>
+        </w:rPr>
+        <w:t>:</w:t>
+      </w:r>
+      <w:r>
+        <w:rPr>
+          <w:rFonts w:ascii="Google Sans" w:eastAsia="Google Sans" w:hAnsi="Google Sans" w:cs="Google Sans"/>
+          <w:color w:val="1F1F1F"/>
+        </w:rPr>
+        <w:t xml:space="preserve"> ?</w:t>
       </w:r>
       <w:proofErr w:type="gramEnd"/>
     </w:p>
@@ -2502,6 +2695,7 @@
   <w:style w:type="character" w:default="1" w:styleId="DefaultParagraphFont">
     <w:name w:val="Default Paragraph Font"/>
     <w:uiPriority w:val="1"/>
+    <w:semiHidden/>
     <w:unhideWhenUsed/>
   </w:style>
   <w:style w:type="table" w:default="1" w:styleId="TableNormal">

</xml_diff>

<commit_message>
I have created the course_insertion file as well as made an adjustment to my tech stack
</commit_message>
<xml_diff>
--- a/Project tech stack.docx
+++ b/Project tech stack.docx
@@ -89,7 +89,7 @@
           <w:bCs/>
           <w:color w:val="3A7C22" w:themeColor="accent6" w:themeShade="BF"/>
         </w:rPr>
-        <w:t>Java Spring Boot</w:t>
+        <w:t>Python Flask</w:t>
       </w:r>
     </w:p>
     <w:p>
@@ -131,15 +131,9 @@
           <w:bCs/>
           <w:color w:val="1F1F1F"/>
         </w:rPr>
-        <w:t>Spring Web</w:t>
-      </w:r>
-      <w:r>
-        <w:rPr>
-          <w:rFonts w:ascii="Google Sans" w:eastAsia="Google Sans" w:hAnsi="Google Sans" w:cs="Google Sans"/>
-          <w:color w:val="1F1F1F"/>
-        </w:rPr>
-        <w:t xml:space="preserve"> and </w:t>
-      </w:r>
+        <w:t xml:space="preserve">Flask, Jinja2 Templating, and </w:t>
+      </w:r>
+      <w:proofErr w:type="spellStart"/>
       <w:r>
         <w:rPr>
           <w:rFonts w:ascii="Google Sans" w:eastAsia="Google Sans" w:hAnsi="Google Sans" w:cs="Google Sans"/>
@@ -147,14 +141,17 @@
           <w:bCs/>
           <w:color w:val="1F1F1F"/>
         </w:rPr>
-        <w:t>Spring Data JPA</w:t>
-      </w:r>
-      <w:r>
-        <w:rPr>
-          <w:rFonts w:ascii="Google Sans" w:eastAsia="Google Sans" w:hAnsi="Google Sans" w:cs="Google Sans"/>
-          <w:color w:val="1F1F1F"/>
-        </w:rPr>
-        <w:t xml:space="preserve"> </w:t>
+        <w:t>mysql</w:t>
+      </w:r>
+      <w:proofErr w:type="spellEnd"/>
+      <w:r>
+        <w:rPr>
+          <w:rFonts w:ascii="Google Sans" w:eastAsia="Google Sans" w:hAnsi="Google Sans" w:cs="Google Sans"/>
+          <w:b/>
+          <w:bCs/>
+          <w:color w:val="1F1F1F"/>
+        </w:rPr>
+        <w:t>-connector-python</w:t>
       </w:r>
     </w:p>
     <w:p>
@@ -2695,7 +2692,6 @@
   <w:style w:type="character" w:default="1" w:styleId="DefaultParagraphFont">
     <w:name w:val="Default Paragraph Font"/>
     <w:uiPriority w:val="1"/>
-    <w:semiHidden/>
     <w:unhideWhenUsed/>
   </w:style>
   <w:style w:type="table" w:default="1" w:styleId="TableNormal">

</xml_diff>